<commit_message>
chore: trim project to required submission files
</commit_message>
<xml_diff>
--- a/数据清洗过程说明文档.docx
+++ b/数据清洗过程说明文档.docx
@@ -747,6 +747,83 @@
                 <w:sz w:val="18"/>
               </w:rPr>
               <w:t>记录 14 个资料来源、发布者、用途和访问日期</w:t>
+            </w:r>
+          </w:p>
+        </w:tc>
+      </w:tr>
+      <w:tr>
+        <w:tc>
+          <w:tcPr>
+            <w:tcW w:type="dxa" w:w="1440"/>
+            <w:vAlign w:val="center"/>
+            <w:tcMar>
+              <w:top w:w="90" w:type="dxa"/>
+              <w:start w:w="120" w:type="dxa"/>
+              <w:bottom w:w="90" w:type="dxa"/>
+              <w:end w:w="120" w:type="dxa"/>
+            </w:tcMar>
+          </w:tcPr>
+          <w:p>
+            <w:pPr>
+              <w:spacing w:after="0" w:line="264" w:lineRule="auto"/>
+            </w:pPr>
+            <w:r>
+              <w:rPr>
+                <w:rFonts w:ascii="Microsoft YaHei" w:hAnsi="Microsoft YaHei" w:eastAsia="Microsoft YaHei"/>
+                <w:color w:val="1E1915"/>
+                <w:sz w:val="18"/>
+              </w:rPr>
+              <w:t>提交数据</w:t>
+            </w:r>
+          </w:p>
+        </w:tc>
+        <w:tc>
+          <w:tcPr>
+            <w:tcW w:type="dxa" w:w="3816"/>
+            <w:vAlign w:val="center"/>
+            <w:tcMar>
+              <w:top w:w="90" w:type="dxa"/>
+              <w:start w:w="120" w:type="dxa"/>
+              <w:bottom w:w="90" w:type="dxa"/>
+              <w:end w:w="120" w:type="dxa"/>
+            </w:tcMar>
+          </w:tcPr>
+          <w:p>
+            <w:pPr>
+              <w:spacing w:after="0" w:line="264" w:lineRule="auto"/>
+            </w:pPr>
+            <w:r>
+              <w:rPr>
+                <w:rFonts w:ascii="Microsoft YaHei" w:hAnsi="Microsoft YaHei" w:eastAsia="Microsoft YaHei"/>
+                <w:color w:val="1E1915"/>
+                <w:sz w:val="18"/>
+              </w:rPr>
+              <w:t>data/processed/木版年画清洗数据.csv</w:t>
+            </w:r>
+          </w:p>
+        </w:tc>
+        <w:tc>
+          <w:tcPr>
+            <w:tcW w:type="dxa" w:w="4104"/>
+            <w:vAlign w:val="center"/>
+            <w:tcMar>
+              <w:top w:w="90" w:type="dxa"/>
+              <w:start w:w="120" w:type="dxa"/>
+              <w:bottom w:w="90" w:type="dxa"/>
+              <w:end w:w="120" w:type="dxa"/>
+            </w:tcMar>
+          </w:tcPr>
+          <w:p>
+            <w:pPr>
+              <w:spacing w:after="0" w:line="264" w:lineRule="auto"/>
+            </w:pPr>
+            <w:r>
+              <w:rPr>
+                <w:rFonts w:ascii="Microsoft YaHei" w:hAnsi="Microsoft YaHei" w:eastAsia="Microsoft YaHei"/>
+                <w:color w:val="1E1915"/>
+                <w:sz w:val="18"/>
+              </w:rPr>
+              <w:t>符合任务书要求的清洗后 CSV 数据集</w:t>
             </w:r>
           </w:p>
         </w:tc>
@@ -3326,7 +3403,7 @@
           <w:color w:val="1E1915"/>
           <w:sz w:val="21"/>
         </w:rPr>
-        <w:t>清洗后 JSON 已包含地图、时间轴、题材、色彩与生成艺术所需字段。</w:t>
+        <w:t>清洗后 CSV 用于课程提交，JSON 用于网页读取，二者字段口径一致。</w:t>
       </w:r>
     </w:p>
     <w:p>

</xml_diff>